<commit_message>
Adjuntos Valdivia, Agencia de Calidad y SBAP leídos; cotización Valdivia ajustada
Co-Authored-By: Claude Opus 5.5 <noreply@anthropic.com>
Claude-Session: https://claude.ai/code/session_01SfkxKP6KzgHJNPZStZzsYX
</commit_message>
<xml_diff>
--- a/Barrido_2026-10-26/03_Compra_Agil/2281-1927-COT26_MuniValdivia_diseno_humedales_1,5M_cierra_28-10/ENVIAR/Cotizacion_2281-1927-COT26_StudiosConari.docx
+++ b/Barrido_2026-10-26/03_Compra_Agil/2281-1927-COT26_MuniValdivia_diseno_humedales_1,5M_cierra_28-10/ENVIAR/Cotizacion_2281-1927-COT26_StudiosConari.docx
@@ -179,7 +179,7 @@
         <w:rPr>
           <w:b w:val="0"/>
         </w:rPr>
-        <w:t>• Diseño gráfico de un conjunto de materiales educativos y de difusión para educación ambiental sobre humedales y borde costero (piezas según términos de referencia).</w:t>
+        <w:t>• Línea gráfica unificada con la identidad institucional que entregue la Municipalidad.</w:t>
       </w:r>
     </w:p>
     <w:p>
@@ -190,7 +190,7 @@
         <w:rPr>
           <w:b w:val="0"/>
         </w:rPr>
-        <w:t>• Ilustraciones propias de la biodiversidad de humedales y ecosistemas costeros.</w:t>
+        <w:t>• 2 infografías educativas para paneles informativos costeros de gran formato (ilustración, iconografía y diagramación).</w:t>
       </w:r>
     </w:p>
     <w:p>
@@ -201,7 +201,7 @@
         <w:rPr>
           <w:b w:val="0"/>
         </w:rPr>
-        <w:t>• Material gráfico de apoyo para actividades educativas y de difusión ambiental.</w:t>
+        <w:t>• Colección de hasta 8 láminas educativas tipo pontonera (especie o elemento por lámina, nombre común y científico, descripción básica, ilustración propia o fotografía con autorización).</w:t>
       </w:r>
     </w:p>
     <w:p>
@@ -212,7 +212,7 @@
         <w:rPr>
           <w:b w:val="0"/>
         </w:rPr>
-        <w:t>• Entrega en archivos digitales listos para imprenta y para redes: PDF (alta resolución), SVG/EPS editables y PNG/JPG. No incluye impresión.</w:t>
+        <w:t>• Material educativo complementario: hasta 6 piezas reutilizables (fichas, afiches o gráficas digitales) sobre aves de humedales, flora nativa, fauna, biodiversidad costera, conservación y buenas prácticas.</w:t>
       </w:r>
     </w:p>
     <w:p>
@@ -223,7 +223,18 @@
         <w:rPr>
           <w:b w:val="0"/>
         </w:rPr>
-        <w:t>• Hasta 2 rondas de correcciones por pieza.</w:t>
+        <w:t>• Propuesta gráfica preliminar, diseños para revisión y 2 instancias de corrección sin costo.</w:t>
+      </w:r>
+    </w:p>
+    <w:p>
+      <w:pPr>
+        <w:spacing w:after="60"/>
+      </w:pPr>
+      <w:r>
+        <w:rPr>
+          <w:b w:val="0"/>
+        </w:rPr>
+        <w:t>• Entrega: PDF alta resolución apto para impresión, JPG/PNG para uso digital y archivos editables en formato equivalente a Illustrator/InDesign (SVG/EPS/PDF editable, Scribus/Inkscape). No incluye impresión.</w:t>
       </w:r>
     </w:p>
     <w:p>
@@ -488,7 +499,7 @@
         <w:rPr>
           <w:b w:val="0"/>
         </w:rPr>
-        <w:t>• Plazo: dentro de los 30 días indicados en la compra.</w:t>
+        <w:t>• Plazo: 30 días corridos desde la aceptación de la orden de compra.</w:t>
       </w:r>
     </w:p>
     <w:p>
@@ -521,7 +532,7 @@
         <w:rPr>
           <w:b w:val="0"/>
         </w:rPr>
-        <w:t>• Herramientas: Inkscape/Scribus/Krita; entrega en formatos estándar (PDF, SVG, EPS, PNG).</w:t>
+        <w:t>• Piezas adicionales a las indicadas se cotizan aparte.</w:t>
       </w:r>
     </w:p>
     <w:p>

</xml_diff>